<commit_message>
Describe the demo web app in the report and fill in cover details
- Add section 3.6 (architecture and main features of the FastAPI +
  React app) with five new figures: architecture diagram and screenshots
  of the comment simulator, detail pop-up, test-set samples and model tab
- Update 1.4, 1.6, 4.1, 4.2 and 4.3 to cover the app, and drop the
  reference to the removed demo.ipynb in 2.3.3
- Set course name to DEEP LEARNING and month to 10 on the cover; remove
  highlights from filled-in fields
- Add optional seed to /api/samples for reproducible sampling
</commit_message>
<xml_diff>
--- a/docs/report/BaoCao_Transformer_PhatHienBinhLuanDocHai.docx
+++ b/docs/report/BaoCao_Transformer_PhatHienBinhLuanDocHai.docx
@@ -110,10 +110,7 @@
         <w:pStyle w:val="CoverTitle"/>
       </w:pPr>
       <w:r>
-        <w:rPr>
-          <w:highlight w:val="yellow"/>
-        </w:rPr>
-        <w:t xml:space="preserve">[TÊN MÔN HỌC]</w:t>
+        <w:t xml:space="preserve">DEEP LEARNING</w:t>
       </w:r>
     </w:p>
     <w:p>
@@ -229,9 +226,6 @@
         <w:pStyle w:val="CoverInfo"/>
       </w:pPr>
       <w:r>
-        <w:rPr>
-          <w:highlight w:val="yellow"/>
-        </w:rPr>
         <w:t xml:space="preserve">2611320 -</w:t>
       </w:r>
       <w:r>
@@ -272,9 +266,8 @@
         <w:rPr>
           <w:i/>
           <w:iCs/>
-          <w:highlight w:val="yellow"/>
-        </w:rPr>
-        <w:t xml:space="preserve">[..]</w:t>
+        </w:rPr>
+        <w:t xml:space="preserve">10</w:t>
       </w:r>
       <w:r>
         <w:t xml:space="preserve"> </w:t>
@@ -524,9 +517,6 @@
               <w:pStyle w:val="TableText"/>
             </w:pPr>
             <w:r>
-              <w:rPr>
-                <w:highlight w:val="yellow"/>
-              </w:rPr>
               <w:t xml:space="preserve">2611320</w:t>
             </w:r>
           </w:p>
@@ -1465,6 +1455,18 @@
         </w:numPr>
       </w:pPr>
       <w:r>
+        <w:t xml:space="preserve">Xây dựng ứng dụng web minh hoạ (FastAPI và React) để gắn nhãn bình luận theo thời gian thực và trực quan hoá trọng số attention.</w:t>
+      </w:r>
+    </w:p>
+    <w:p>
+      <w:pPr>
+        <w:pStyle w:val="Compact"/>
+        <w:numPr>
+          <w:ilvl w:val="0"/>
+          <w:numId w:val="1004"/>
+        </w:numPr>
+      </w:pPr>
+      <w:r>
         <w:t xml:space="preserve">Phân tích, đánh giá kết quả đạt được, hạn chế và đề xuất hướng phát triển.</w:t>
       </w:r>
     </w:p>
@@ -1546,6 +1548,18 @@
       </w:pPr>
       <w:r>
         <w:t xml:space="preserve">Một notebook hoàn chỉnh, có thể chạy lại được, cài đặt Transformer Encoder từ đầu, huấn luyện và đánh giá trên ViHSD, kèm hàm suy luận cho câu bình luận mới.</w:t>
+      </w:r>
+    </w:p>
+    <w:p>
+      <w:pPr>
+        <w:pStyle w:val="Compact"/>
+        <w:numPr>
+          <w:ilvl w:val="0"/>
+          <w:numId w:val="1006"/>
+        </w:numPr>
+      </w:pPr>
+      <w:r>
+        <w:t xml:space="preserve">Một ứng dụng web minh hoạ cho phép nhập bình luận, nhận nhãn dự đoán ngay lập tức, xem các bước tiền xử lý và trọng số attention của từng câu.</w:t>
       </w:r>
     </w:p>
     <w:p>
@@ -4232,19 +4246,7 @@
         <w:t xml:space="preserve"> </w:t>
       </w:r>
       <w:r>
-        <w:t xml:space="preserve">(notebook</w:t>
-      </w:r>
-      <w:r>
-        <w:t xml:space="preserve"> </w:t>
-      </w:r>
-      <w:r>
-        <w:rPr>
-          <w:rStyle w:val="VerbatimChar"/>
-        </w:rPr>
-        <w:t xml:space="preserve">demo.ipynb</w:t>
-      </w:r>
-      <w:r>
-        <w:t xml:space="preserve">, trọng số khởi tạo ngẫu nhiên, chưa huấn luyện). Mỗi hàng của ma trận trọng số là một phân phối xác suất cho biết token truy vấn</w:t>
+        <w:t xml:space="preserve">(trọng số khởi tạo ngẫu nhiên, chưa huấn luyện). Mỗi hàng của ma trận trọng số là một phân phối xác suất cho biết token truy vấn</w:t>
       </w:r>
       <w:r>
         <w:t xml:space="preserve"> </w:t>
@@ -15893,6 +15895,584 @@
     </w:p>
     <w:p>
       <w:pPr>
+        <w:pStyle w:val="Heading2"/>
+      </w:pPr>
+      <w:r>
+        <w:t xml:space="preserve">3.6. Xây dựng ứng dụng minh hoạ</w:t>
+      </w:r>
+    </w:p>
+    <w:p>
+      <w:pPr>
+        <w:pStyle w:val="FirstParagraph"/>
+      </w:pPr>
+      <w:r>
+        <w:t xml:space="preserve">Để đưa mô hình ra khỏi notebook và quan sát cách nó hoạt động trong một tình huống gần với thực tế, nhóm xây dựng một ứng dụng web minh hoạ. Ứng dụng mô phỏng khung bình luận của mạng xã hội: người dùng nhập bình luận, mô hình gắn nhãn ngay lập tức, bình luận độc hại được làm mờ giống một hệ thống kiểm duyệt. Với mỗi bình luận, người dùng có thể xem lại toàn bộ quá trình xử lý, từ câu sau làm sạch, câu sau tách từ đến trọng số attention của từng layer và head.</w:t>
+      </w:r>
+    </w:p>
+    <w:p>
+      <w:pPr>
+        <w:pStyle w:val="Heading3"/>
+      </w:pPr>
+      <w:r>
+        <w:t xml:space="preserve">3.6.1. Kiến trúc hệ thống</w:t>
+      </w:r>
+    </w:p>
+    <w:p>
+      <w:pPr>
+        <w:pStyle w:val="FirstParagraph"/>
+      </w:pPr>
+      <w:r>
+        <w:t xml:space="preserve">Ứng dụng gồm ba thành phần, được minh hoạ trong Hình 9:</w:t>
+      </w:r>
+    </w:p>
+    <w:p>
+      <w:pPr>
+        <w:pStyle w:val="Compact"/>
+        <w:numPr>
+          <w:ilvl w:val="0"/>
+          <w:numId w:val="1013"/>
+        </w:numPr>
+      </w:pPr>
+      <w:r>
+        <w:rPr>
+          <w:b/>
+          <w:bCs/>
+        </w:rPr>
+        <w:t xml:space="preserve">Backend FastAPI.</w:t>
+      </w:r>
+      <w:r>
+        <w:t xml:space="preserve"> Khi khởi động, server nạp checkpoint, từ điển và cấu hình do notebook huấn luyện lưu ra (mục 3.4.2, Bước 7), đồng thời chạy mô hình trên toàn bộ tập test một lần và lưu kết quả vào bộ nhớ đệm. Server dùng lại đúng các hàm làm sạch và tách từ của notebook, nên câu được xử lý giống hệt lúc huấn luyện. Các endpoint chính gồm </w:t>
+      </w:r>
+      <w:r>
+        <w:rPr>
+          <w:rStyle w:val="VerbatimChar"/>
+        </w:rPr>
+        <w:t xml:space="preserve">/api/analyze</w:t>
+      </w:r>
+      <w:r>
+        <w:t xml:space="preserve"> (phân tích một câu, trả về nhãn, xác suất, token và ma trận attention của mọi layer và head), </w:t>
+      </w:r>
+      <w:r>
+        <w:rPr>
+          <w:rStyle w:val="VerbatimChar"/>
+        </w:rPr>
+        <w:t xml:space="preserve">/api/samples</w:t>
+      </w:r>
+      <w:r>
+        <w:t xml:space="preserve"> (lấy ngẫu nhiên câu từ tập test) và </w:t>
+      </w:r>
+      <w:r>
+        <w:rPr>
+          <w:rStyle w:val="VerbatimChar"/>
+        </w:rPr>
+        <w:t xml:space="preserve">/api/model</w:t>
+      </w:r>
+      <w:r>
+        <w:t xml:space="preserve"> (cấu hình và kết quả trên tập test). FastAPI tự sinh tài liệu API tại địa chỉ </w:t>
+      </w:r>
+      <w:r>
+        <w:rPr>
+          <w:rStyle w:val="VerbatimChar"/>
+        </w:rPr>
+        <w:t xml:space="preserve">/docs</w:t>
+      </w:r>
+      <w:r>
+        <w:t xml:space="preserve">.</w:t>
+      </w:r>
+    </w:p>
+    <w:p>
+      <w:pPr>
+        <w:pStyle w:val="Compact"/>
+        <w:numPr>
+          <w:ilvl w:val="0"/>
+          <w:numId w:val="1013"/>
+        </w:numPr>
+      </w:pPr>
+      <w:r>
+        <w:rPr>
+          <w:b/>
+          <w:bCs/>
+        </w:rPr>
+        <w:t xml:space="preserve">Giao diện web.</w:t>
+      </w:r>
+      <w:r>
+        <w:t xml:space="preserve"> Viết bằng React, TypeScript và Tailwind CSS, giao tiếp với backend qua HTTP và JSON. Giao diện được build thành các file tĩnh và do chính FastAPI phục vụ trên cùng một cổng, nên toàn bộ ứng dụng chạy bằng một lệnh </w:t>
+      </w:r>
+      <w:r>
+        <w:rPr>
+          <w:rStyle w:val="VerbatimChar"/>
+        </w:rPr>
+        <w:t xml:space="preserve">make start</w:t>
+      </w:r>
+      <w:r>
+        <w:t xml:space="preserve">.</w:t>
+      </w:r>
+    </w:p>
+    <w:p>
+      <w:pPr>
+        <w:pStyle w:val="Compact"/>
+        <w:numPr>
+          <w:ilvl w:val="0"/>
+          <w:numId w:val="1013"/>
+        </w:numPr>
+      </w:pPr>
+      <w:r>
+        <w:rPr>
+          <w:b/>
+          <w:bCs/>
+        </w:rPr>
+        <w:t xml:space="preserve">Dữ liệu và mô hình.</w:t>
+      </w:r>
+      <w:r>
+        <w:t xml:space="preserve"> Gồm checkpoint, từ điển, file cấu hình và tập test ViHSD. Ứng dụng không huấn luyện lại mô hình mà chỉ đọc các file này.</w:t>
+      </w:r>
+    </w:p>
+    <w:p>
+      <w:pPr>
+        <w:pStyle w:val="Figure"/>
+      </w:pPr>
+      <w:r>
+        <w:drawing>
+          <wp:inline>
+            <wp:extent cx="5753100" cy="2275090"/>
+            <wp:effectExtent b="0" l="0" r="0" t="0"/>
+            <wp:docPr descr="" title="" id="200" name="Picture"/>
+            <a:graphic>
+              <a:graphicData uri="http://schemas.openxmlformats.org/drawingml/2006/picture">
+                <pic:pic>
+                  <pic:nvPicPr>
+                    <pic:cNvPr descr="report/images/hinh9_kien_truc_ung_dung.png" id="201" name="Picture"/>
+                    <pic:cNvPicPr>
+                      <a:picLocks noChangeArrowheads="1" noChangeAspect="1"/>
+                    </pic:cNvPicPr>
+                  </pic:nvPicPr>
+                  <pic:blipFill>
+                    <a:blip r:embed="rIdApp9"/>
+                    <a:stretch>
+                      <a:fillRect/>
+                    </a:stretch>
+                  </pic:blipFill>
+                  <pic:spPr bwMode="auto">
+                    <a:xfrm>
+                      <a:off x="0" y="0"/>
+                      <a:ext cx="5753100" cy="2275090"/>
+                    </a:xfrm>
+                    <a:prstGeom prst="rect">
+                      <a:avLst/>
+                    </a:prstGeom>
+                    <a:noFill/>
+                    <a:ln w="9525">
+                      <a:noFill/>
+                      <a:headEnd/>
+                      <a:tailEnd/>
+                    </a:ln>
+                  </pic:spPr>
+                </pic:pic>
+              </a:graphicData>
+            </a:graphic>
+          </wp:inline>
+        </w:drawing>
+      </w:r>
+    </w:p>
+    <w:p>
+      <w:pPr>
+        <w:pStyle w:val="ImageCaption"/>
+      </w:pPr>
+      <w:r>
+        <w:t xml:space="preserve">Hình 9: Kiến trúc ứng dụng minh hoạ</w:t>
+      </w:r>
+    </w:p>
+    <w:p>
+      <w:pPr>
+        <w:pStyle w:val="FirstParagraph"/>
+      </w:pPr>
+      <w:r>
+        <w:t xml:space="preserve">Khi suy luận, ứng dụng chạy mô hình trên CPU. Do backend MPS không tất định (mục 3.4.4), kết quả trên tập test mà ứng dụng tính lại (accuracy 0,8308 và macro-F1 0,6105) lệch nhẹ so với lần chạy chính thức ở Bảng 9 (0,8286 và 0,6083).</w:t>
+      </w:r>
+    </w:p>
+    <w:p>
+      <w:pPr>
+        <w:pStyle w:val="Heading3"/>
+      </w:pPr>
+      <w:r>
+        <w:t xml:space="preserve">3.6.2. Các chức năng chính</w:t>
+      </w:r>
+    </w:p>
+    <w:p>
+      <w:pPr>
+        <w:pStyle w:val="FirstParagraph"/>
+      </w:pPr>
+      <w:r>
+        <w:rPr>
+          <w:b/>
+          <w:bCs/>
+        </w:rPr>
+        <w:t xml:space="preserve">Mô phỏng bình luận.</w:t>
+      </w:r>
+      <w:r>
+        <w:t xml:space="preserve"> Đây là màn hình chính của ứng dụng (Hình 10). Người dùng nhập bình luận và bấm Enter để gửi. Có thể gửi liên tục mà không cần chờ kết quả của bình luận trước. Mỗi bình luận được gắn nhãn CLEAN, OFFENSIVE hoặc HATE kèm độ tin cậy, viền bên trái tô theo màu của nhãn. Khi bật chế độ </w:t>
+      </w:r>
+      <w:r>
+        <w:rPr>
+          <w:b/>
+          <w:bCs/>
+        </w:rPr>
+        <w:t xml:space="preserve">Ẩn bình luận độc hại</w:t>
+      </w:r>
+      <w:r>
+        <w:t xml:space="preserve">, các bình luận OFFENSIVE và HATE bị làm mờ kèm cảnh báo, người dùng bấm </w:t>
+      </w:r>
+      <w:r>
+        <w:rPr>
+          <w:b/>
+          <w:bCs/>
+        </w:rPr>
+        <w:t xml:space="preserve">Xem</w:t>
+      </w:r>
+      <w:r>
+        <w:t xml:space="preserve"> để hiện nội dung. Câu chỉ chứa đường dẫn hoặc mention sẽ rỗng sau khi làm sạch và được gắn nhãn TRỐNG. Phía trên khung bình luận có thống kê số bình luận theo từng nhãn. Lịch sử bình luận được lưu trong trình duyệt nên không mất khi tải lại trang.</w:t>
+      </w:r>
+    </w:p>
+    <w:p>
+      <w:pPr>
+        <w:pStyle w:val="Figure"/>
+      </w:pPr>
+      <w:r>
+        <w:drawing>
+          <wp:inline>
+            <wp:extent cx="5063736" cy="4680000"/>
+            <wp:effectExtent b="0" l="0" r="0" t="0"/>
+            <wp:docPr descr="" title="" id="202" name="Picture"/>
+            <a:graphic>
+              <a:graphicData uri="http://schemas.openxmlformats.org/drawingml/2006/picture">
+                <pic:pic>
+                  <pic:nvPicPr>
+                    <pic:cNvPr descr="report/images/hinh10_mo_phong_binh_luan.png" id="203" name="Picture"/>
+                    <pic:cNvPicPr>
+                      <a:picLocks noChangeArrowheads="1" noChangeAspect="1"/>
+                    </pic:cNvPicPr>
+                  </pic:nvPicPr>
+                  <pic:blipFill>
+                    <a:blip r:embed="rIdApp10"/>
+                    <a:stretch>
+                      <a:fillRect/>
+                    </a:stretch>
+                  </pic:blipFill>
+                  <pic:spPr bwMode="auto">
+                    <a:xfrm>
+                      <a:off x="0" y="0"/>
+                      <a:ext cx="5063736" cy="4680000"/>
+                    </a:xfrm>
+                    <a:prstGeom prst="rect">
+                      <a:avLst/>
+                    </a:prstGeom>
+                    <a:noFill/>
+                    <a:ln w="9525">
+                      <a:noFill/>
+                      <a:headEnd/>
+                      <a:tailEnd/>
+                    </a:ln>
+                  </pic:spPr>
+                </pic:pic>
+              </a:graphicData>
+            </a:graphic>
+          </wp:inline>
+        </w:drawing>
+      </w:r>
+    </w:p>
+    <w:p>
+      <w:pPr>
+        <w:pStyle w:val="ImageCaption"/>
+      </w:pPr>
+      <w:r>
+        <w:t xml:space="preserve">Hình 10: Màn hình mô phỏng bình luận, hai bình luận HATE đang bị làm mờ</w:t>
+      </w:r>
+    </w:p>
+    <w:p>
+      <w:pPr>
+        <w:pStyle w:val="FirstParagraph"/>
+      </w:pPr>
+      <w:r>
+        <w:t xml:space="preserve">Các ví dụ trong Hình 10 cho thấy mô hình phân biệt được một số trường hợp tinh tế. Câu </w:t>
+      </w:r>
+      <w:r>
+        <w:rPr>
+          <w:b/>
+          <w:bCs/>
+        </w:rPr>
+        <w:t xml:space="preserve">“Bài này viết dở quá, đọc mà buồn ngủ”</w:t>
+      </w:r>
+      <w:r>
+        <w:t xml:space="preserve"> mang ý chê nhưng không chứa từ ngữ xúc phạm nên được gán CLEAN. Câu </w:t>
+      </w:r>
+      <w:r>
+        <w:rPr>
+          <w:b/>
+          <w:bCs/>
+        </w:rPr>
+        <w:t xml:space="preserve">“Mẹ nó chứ, lại hết hàng rồi”</w:t>
+      </w:r>
+      <w:r>
+        <w:t xml:space="preserve"> có từ ngữ thô tục nhưng không nhắm vào ai nên được gán OFFENSIVE, đúng với định nghĩa của ViHSD (mục 2.1). Câu </w:t>
+      </w:r>
+      <w:r>
+        <w:rPr>
+          <w:b/>
+          <w:bCs/>
+        </w:rPr>
+        <w:t xml:space="preserve">“Thằng ngu này nói chuyện chán vãi”</w:t>
+      </w:r>
+      <w:r>
+        <w:t xml:space="preserve"> nhắm vào một người cụ thể nên được gán HATE.</w:t>
+      </w:r>
+    </w:p>
+    <w:p>
+      <w:pPr>
+        <w:pStyle w:val="BodyText"/>
+      </w:pPr>
+      <w:r>
+        <w:rPr>
+          <w:b/>
+          <w:bCs/>
+        </w:rPr>
+        <w:t xml:space="preserve">Chi tiết bình luận.</w:t>
+      </w:r>
+      <w:r>
+        <w:t xml:space="preserve"> Khi bấm vào một bình luận, ứng dụng mở cửa sổ chi tiết (Hình 11) gồm bốn phần: bình luận gốc, nhãn dự đoán kèm xác suất của ba lớp, các bước tiền xử lý (câu sau làm sạch, câu sau tách từ, số token, số token </w:t>
+      </w:r>
+      <w:r>
+        <w:rPr>
+          <w:rStyle w:val="VerbatimChar"/>
+        </w:rPr>
+        <w:t xml:space="preserve">&lt;unk&gt;</w:t>
+      </w:r>
+      <w:r>
+        <w:t xml:space="preserve">) và trọng số self-attention. Ở phần attention, người dùng chọn layer và head (hoặc trung bình các head). Mỗi token được tô nền theo mức attention mà nó nhận được từ các token khác. Token không có trong từ điển được đánh dấu bằng viền đứt. Heatmap bên dưới thể hiện đầy đủ ma trận trọng số, mỗi hàng là phân phối softmax của một query trên toàn bộ key.</w:t>
+      </w:r>
+    </w:p>
+    <w:p>
+      <w:pPr>
+        <w:pStyle w:val="Figure"/>
+      </w:pPr>
+      <w:r>
+        <w:drawing>
+          <wp:inline>
+            <wp:extent cx="3724050" cy="4680000"/>
+            <wp:effectExtent b="0" l="0" r="0" t="0"/>
+            <wp:docPr descr="" title="" id="204" name="Picture"/>
+            <a:graphic>
+              <a:graphicData uri="http://schemas.openxmlformats.org/drawingml/2006/picture">
+                <pic:pic>
+                  <pic:nvPicPr>
+                    <pic:cNvPr descr="report/images/hinh11_popup_chi_tiet.png" id="205" name="Picture"/>
+                    <pic:cNvPicPr>
+                      <a:picLocks noChangeArrowheads="1" noChangeAspect="1"/>
+                    </pic:cNvPicPr>
+                  </pic:nvPicPr>
+                  <pic:blipFill>
+                    <a:blip r:embed="rIdApp11"/>
+                    <a:stretch>
+                      <a:fillRect/>
+                    </a:stretch>
+                  </pic:blipFill>
+                  <pic:spPr bwMode="auto">
+                    <a:xfrm>
+                      <a:off x="0" y="0"/>
+                      <a:ext cx="3724050" cy="4680000"/>
+                    </a:xfrm>
+                    <a:prstGeom prst="rect">
+                      <a:avLst/>
+                    </a:prstGeom>
+                    <a:noFill/>
+                    <a:ln w="9525">
+                      <a:noFill/>
+                      <a:headEnd/>
+                      <a:tailEnd/>
+                    </a:ln>
+                  </pic:spPr>
+                </pic:pic>
+              </a:graphicData>
+            </a:graphic>
+          </wp:inline>
+        </w:drawing>
+      </w:r>
+    </w:p>
+    <w:p>
+      <w:pPr>
+        <w:pStyle w:val="ImageCaption"/>
+      </w:pPr>
+      <w:r>
+        <w:t xml:space="preserve">Hình 11: Cửa sổ chi tiết của một bình luận được gán nhãn HATE</w:t>
+      </w:r>
+    </w:p>
+    <w:p>
+      <w:pPr>
+        <w:pStyle w:val="FirstParagraph"/>
+      </w:pPr>
+      <w:r>
+        <w:t xml:space="preserve">Trong ví dụ ở Hình 11, từ ghép </w:t>
+      </w:r>
+      <w:r>
+        <w:rPr>
+          <w:rStyle w:val="VerbatimChar"/>
+        </w:rPr>
+        <w:t xml:space="preserve">chán_vãi</w:t>
+      </w:r>
+      <w:r>
+        <w:t xml:space="preserve"> không có trong từ điển nên được mã hoá thành </w:t>
+      </w:r>
+      <w:r>
+        <w:rPr>
+          <w:rStyle w:val="VerbatimChar"/>
+        </w:rPr>
+        <w:t xml:space="preserve">&lt;unk&gt;</w:t>
+      </w:r>
+      <w:r>
+        <w:t xml:space="preserve">. Ở layer cuối, phần lớn trọng số attention tập trung vào hai token “thằng” và “ngu”, là những từ mang sắc thái xúc phạm trong câu. Cần lưu ý trọng số attention chỉ cho biết mô hình tổng hợp thông tin từ đâu, chưa đủ để kết luận đó là nguyên nhân của quyết định phân loại.</w:t>
+      </w:r>
+    </w:p>
+    <w:p>
+      <w:pPr>
+        <w:pStyle w:val="BodyText"/>
+      </w:pPr>
+      <w:r>
+        <w:rPr>
+          <w:b/>
+          <w:bCs/>
+        </w:rPr>
+        <w:t xml:space="preserve">Ví dụ từ tập test.</w:t>
+      </w:r>
+      <w:r>
+        <w:t xml:space="preserve"> Màn hình này lấy ngẫu nhiên một số câu từ tập test, có tuỳ chọn chỉ lấy câu độc hại, rồi hiển thị nhãn thật, nhãn dự đoán và độ tin cậy của từng câu (Hình 12). Bấm vào một dòng sẽ hiện phân tích chi tiết của câu đó, giống cửa sổ ở Hình 11. Trong ví dụ ở Hình 12, mô hình dự đoán đúng 5 trên 6 câu. Câu sai duy nhất có nhãn thật OFFENSIVE nhưng bị dự đoán thành HATE với độ tin cậy chỉ 48,3%, minh hoạ đúng điểm yếu đã phân tích ở mục 3.5.</w:t>
+      </w:r>
+    </w:p>
+    <w:p>
+      <w:pPr>
+        <w:pStyle w:val="Figure"/>
+      </w:pPr>
+      <w:r>
+        <w:drawing>
+          <wp:inline>
+            <wp:extent cx="5753100" cy="4139573"/>
+            <wp:effectExtent b="0" l="0" r="0" t="0"/>
+            <wp:docPr descr="" title="" id="206" name="Picture"/>
+            <a:graphic>
+              <a:graphicData uri="http://schemas.openxmlformats.org/drawingml/2006/picture">
+                <pic:pic>
+                  <pic:nvPicPr>
+                    <pic:cNvPr descr="report/images/hinh12_vi_du_tap_test.png" id="207" name="Picture"/>
+                    <pic:cNvPicPr>
+                      <a:picLocks noChangeArrowheads="1" noChangeAspect="1"/>
+                    </pic:cNvPicPr>
+                  </pic:nvPicPr>
+                  <pic:blipFill>
+                    <a:blip r:embed="rIdApp12"/>
+                    <a:stretch>
+                      <a:fillRect/>
+                    </a:stretch>
+                  </pic:blipFill>
+                  <pic:spPr bwMode="auto">
+                    <a:xfrm>
+                      <a:off x="0" y="0"/>
+                      <a:ext cx="5753100" cy="4139573"/>
+                    </a:xfrm>
+                    <a:prstGeom prst="rect">
+                      <a:avLst/>
+                    </a:prstGeom>
+                    <a:noFill/>
+                    <a:ln w="9525">
+                      <a:noFill/>
+                      <a:headEnd/>
+                      <a:tailEnd/>
+                    </a:ln>
+                  </pic:spPr>
+                </pic:pic>
+              </a:graphicData>
+            </a:graphic>
+          </wp:inline>
+        </w:drawing>
+      </w:r>
+    </w:p>
+    <w:p>
+      <w:pPr>
+        <w:pStyle w:val="ImageCaption"/>
+      </w:pPr>
+      <w:r>
+        <w:t xml:space="preserve">Hình 12: Màn hình ví dụ từ tập test</w:t>
+      </w:r>
+    </w:p>
+    <w:p>
+      <w:pPr>
+        <w:pStyle w:val="FirstParagraph"/>
+      </w:pPr>
+      <w:r>
+        <w:rPr>
+          <w:b/>
+          <w:bCs/>
+        </w:rPr>
+        <w:t xml:space="preserve">Thông tin mô hình.</w:t>
+      </w:r>
+      <w:r>
+        <w:t xml:space="preserve"> Màn hình cuối tóm tắt kiến trúc mô hình, pipeline xử lý và kết quả trên tập test gồm precision, recall, F1 của từng lớp cùng confusion matrix (Hình 13). Các số liệu này được tính trực tiếp từ checkpoint mà ứng dụng đang dùng.</w:t>
+      </w:r>
+    </w:p>
+    <w:p>
+      <w:pPr>
+        <w:pStyle w:val="Figure"/>
+      </w:pPr>
+      <w:r>
+        <w:drawing>
+          <wp:inline>
+            <wp:extent cx="5144758" cy="4680000"/>
+            <wp:effectExtent b="0" l="0" r="0" t="0"/>
+            <wp:docPr descr="" title="" id="208" name="Picture"/>
+            <a:graphic>
+              <a:graphicData uri="http://schemas.openxmlformats.org/drawingml/2006/picture">
+                <pic:pic>
+                  <pic:nvPicPr>
+                    <pic:cNvPr descr="report/images/hinh13_thong_tin_mo_hinh.png" id="209" name="Picture"/>
+                    <pic:cNvPicPr>
+                      <a:picLocks noChangeArrowheads="1" noChangeAspect="1"/>
+                    </pic:cNvPicPr>
+                  </pic:nvPicPr>
+                  <pic:blipFill>
+                    <a:blip r:embed="rIdApp13"/>
+                    <a:stretch>
+                      <a:fillRect/>
+                    </a:stretch>
+                  </pic:blipFill>
+                  <pic:spPr bwMode="auto">
+                    <a:xfrm>
+                      <a:off x="0" y="0"/>
+                      <a:ext cx="5144758" cy="4680000"/>
+                    </a:xfrm>
+                    <a:prstGeom prst="rect">
+                      <a:avLst/>
+                    </a:prstGeom>
+                    <a:noFill/>
+                    <a:ln w="9525">
+                      <a:noFill/>
+                      <a:headEnd/>
+                      <a:tailEnd/>
+                    </a:ln>
+                  </pic:spPr>
+                </pic:pic>
+              </a:graphicData>
+            </a:graphic>
+          </wp:inline>
+        </w:drawing>
+      </w:r>
+    </w:p>
+    <w:p>
+      <w:pPr>
+        <w:pStyle w:val="ImageCaption"/>
+      </w:pPr>
+      <w:r>
+        <w:t xml:space="preserve">Hình 13: Màn hình thông tin mô hình</w:t>
+      </w:r>
+    </w:p>
+    <w:p>
+      <w:pPr>
         <w:pStyle w:val="Heading1"/>
       </w:pPr>
       <w:r>
@@ -16096,6 +16676,14 @@
     </w:p>
     <w:p>
       <w:pPr>
+        <w:pStyle w:val="BodyText"/>
+      </w:pPr>
+      <w:r>
+        <w:t xml:space="preserve">Ngoài ra, nhóm đã đóng gói mô hình thành một ứng dụng web minh hoạ gồm backend FastAPI và giao diện React (mục 3.6). Ứng dụng mô phỏng khung bình luận của mạng xã hội: mỗi bình luận được gắn nhãn ngay khi gửi, bình luận độc hại được làm mờ, và người dùng có thể xem chi tiết các bước tiền xử lý cùng trọng số attention của từng câu.</w:t>
+      </w:r>
+    </w:p>
+    <w:p>
+      <w:pPr>
         <w:pStyle w:val="Heading2"/>
       </w:pPr>
       <w:r>
@@ -16207,7 +16795,7 @@
         </w:numPr>
       </w:pPr>
       <w:r>
-        <w:t xml:space="preserve">Mô hình chỉ xử lý theo dạng batch trong notebook, chưa đóng gói thành dịch vụ kiểm duyệt trực tuyến.</w:t>
+        <w:t xml:space="preserve">Ứng dụng minh hoạ mới chạy trên máy cục bộ, chưa có xác thực người dùng, giới hạn tần suất truy cập hay cơ chế để người kiểm duyệt sửa nhãn sai, nên chưa sẵn sàng triển khai như một dịch vụ kiểm duyệt thực tế.</w:t>
       </w:r>
     </w:p>
     <w:p>
@@ -16329,19 +16917,19 @@
         </w:numPr>
       </w:pPr>
       <w:r>
-        <w:t xml:space="preserve">Trực quan hoá trọng số attention của mô hình đã huấn luyện trên các bình luận thật để phân tích mô hình</w:t>
-      </w:r>
-      <w:r>
-        <w:t xml:space="preserve"> </w:t>
-      </w:r>
-      <w:r>
-        <w:t xml:space="preserve">“chú ý”</w:t>
-      </w:r>
-      <w:r>
-        <w:t xml:space="preserve"> </w:t>
-      </w:r>
-      <w:r>
-        <w:t xml:space="preserve">vào những từ nào khi ra quyết định.</w:t>
+        <w:t xml:space="preserve">Từ công cụ trực quan hoá attention trong ứng dụng (mục 3.6), phân tích có hệ thống trên nhiều bình luận thật để tìm hiểu mô hình “chú ý” vào những từ nào khi ra quyết định, và đối chiếu với các phương pháp giải thích mô hình khác.</w:t>
+      </w:r>
+    </w:p>
+    <w:p>
+      <w:pPr>
+        <w:pStyle w:val="Compact"/>
+        <w:numPr>
+          <w:ilvl w:val="0"/>
+          <w:numId w:val="1015"/>
+        </w:numPr>
+      </w:pPr>
+      <w:r>
+        <w:t xml:space="preserve">Triển khai ứng dụng lên máy chủ và bổ sung chức năng cho người kiểm duyệt đánh dấu nhãn sai, nhằm thu thập thêm dữ liệu gán nhãn để huấn luyện lại mô hình.</w:t>
       </w:r>
     </w:p>
     <w:p>

</xml_diff>